<commit_message>
feat: activate 4.0.0 ensemble, temporal-motion audit and webcam records
- register SBAI-MDL-ISL-4.0.0 (109-class real ensemble) as active with M11-M13 gate, calibration and policy evidence
- add motion-sensitivity probes, class-group metrics and trajectory ablation (gate FAIL, 4.0.0 retained)
- add Live 3-tick countdown UX, Settings threshold note and new eval/pin tests (147 backend, 60 frontend)
- record 15-sign webcam observations in webcam_truth.csv, checklist and Docs/37 17.1
- ignore large backup and trajectory tensors; refresh README test counts
</commit_message>
<xml_diff>
--- a/SignBridge_AI_Final_Project_Report.docx
+++ b/SignBridge_AI_Final_Project_Report.docx
@@ -1137,7 +1137,7 @@
           <w:i w:val="0"/>
           <w:sz w:val="24"/>
         </w:rPr>
-        <w:t>Temporal gesture recognition is performed by a deep recurrent neural network utilizing two stacked Gated Recurrent Unit (GRU) layers (128 and 64 units) regularized by recurrent dropout, followed by a dense projection layer and a 50-class softmax classification head. Evaluated on a rigorously curated benchmark dataset of 7,438 sequences under a strictly signer-independent partition rule (SPLIT-1.0), the model achieves a superior classification accuracy of 82.42%, a macro precision of 83.24%, a macro recall of 82.36%, and a macro F1-score of 82.30% across 1,650 unseen test sequences performed by disjoint signers, outperforming a baseline LSTM model (77.27% accuracy, 76.36% F1). Demonstrating an ultra-low inference latency of just 0.36 milliseconds per sample on standard CPU architectures, the system bridges the final communication gap through dual-modal output: real-time visual sentence accumulation and instantaneous audible speech synthesis via the HTML5 Web Speech API, complemented by a reverse Text-to-Sign dictionary channel for complete two-way interaction.</w:t>
+        <w:t>Temporal gesture recognition is performed by a deployed three-way ensemble of deep recurrent neural networks that averages a Long Short-Term Memory (LSTM) network and a Gated Recurrent Unit (GRU) network — each comprising two stacked layers (128 and 64 units) regularized by recurrent dropout — with a mirror test-time-augmentation branch evaluated over [x, mirror(x)], followed by a dense projection layer and a 109-class softmax classification head. Evaluated on a rigorously curated benchmark dataset of 14,826 sequences under a strictly signer-independent partition rule (SPLIT-4.0), the model achieves a superior classification accuracy of 81.29%, a macro precision of 81.90%, a macro recall of 81.22%, and a macro F1-score of 80.79% across 3,629 unseen test sequences performed by disjoint signers, outperforming a baseline LSTM model (75.67% accuracy, 75.06% F1). Demonstrating an inference latency of approximately 0.37 seconds (median, p50) per sign window on standard CPU architectures, the system bridges the final communication gap through dual-modal output: real-time visual sentence accumulation and instantaneous audible speech synthesis via the HTML5 Web Speech API, complemented by a reverse Text-to-Sign dictionary channel for complete two-way interaction.</w:t>
       </w:r>
     </w:p>
     <w:p>
@@ -4416,7 +4416,7 @@
                 <w:rFonts w:ascii="Times New Roman" w:hAnsi="Times New Roman"/>
                 <w:sz w:val="20"/>
               </w:rPr>
-              <w:t>Deep Learning Model Training and Validation Convergence over 75 Epochs</w:t>
+              <w:t>Deep Learning Model Training and Validation Convergence over 130 (LSTM) / 94 (GRU) Epochs</w:t>
             </w:r>
           </w:p>
         </w:tc>
@@ -4487,7 +4487,7 @@
                 <w:rFonts w:ascii="Times New Roman" w:hAnsi="Times New Roman"/>
                 <w:sz w:val="20"/>
               </w:rPr>
-              <w:t>Class-Wise F1-Score Distribution across 50 Indian Sign Language Classes</w:t>
+              <w:t>Class-Wise F1-Score Distribution across 109 Indian Sign Language Classes</w:t>
             </w:r>
           </w:p>
         </w:tc>
@@ -5269,7 +5269,7 @@
           <w:i w:val="0"/>
           <w:sz w:val="24"/>
         </w:rPr>
-        <w:t>4. To design, train, and evaluate a lightweight deep temporal Gated Recurrent Unit (GRU) neural network capable of recognizing 50 standardized Indian Sign Language vocabulary classes in real time with sub-millisecond CPU inference latency.</w:t>
+        <w:t>4. To design, train, and evaluate a lightweight deep temporal Gated Recurrent Unit (GRU) neural network capable of recognizing 109 standardized Indian Sign Language vocabulary classes in real time with sub-second CPU inference latency.</w:t>
       </w:r>
     </w:p>
     <w:p>
@@ -5985,7 +5985,7 @@
           <w:i w:val="0"/>
           <w:sz w:val="24"/>
         </w:rPr>
-        <w:t>Temporal sequence recognition is performed by a deep recurrent neural network constructed using Keras 3 and TensorFlow 2.16 (Model ID: `SBAI-MDL-ISL-1.0.0`). The network architecture takes an input sequence tensor of shape $(45, 189)$ and comprises:</w:t>
+        <w:t>Temporal sequence recognition is performed by deep recurrent neural networks constructed using Keras 3 and TensorFlow 2.16 (Model ID: `SBAI-MDL-ISL-4.0.0`). The active deployed model is a three-way ensemble that averages a Long Short-Term Memory (LSTM) network, a Gated Recurrent Unit (GRU) network, and a mirror test-time-augmentation branch evaluated over [x, mirror(x)]; the LSTM and GRU branches each contain 128 and 64 hidden units. Each branch takes an input sequence tensor of shape $(45, 189)$; the GRU branch comprises:</w:t>
       </w:r>
     </w:p>
     <w:p>
@@ -6060,7 +6060,7 @@
         <w:t xml:space="preserve">• Classification Output Layer: </w:t>
       </w:r>
       <w:r>
-        <w:t>A Dense softmax output layer with 50 units corresponding to the 50 Indian Sign Language vocabulary classes, outputting class probability distributions $\hat{y} \in [0, 1]^{50}$.</w:t>
+        <w:t>A Dense softmax output layer with 109 units corresponding to the 109 Indian Sign Language vocabulary classes, outputting class probability distributions $\hat{y} \in [0, 1]^{109}$.</w:t>
       </w:r>
     </w:p>
     <w:p>
@@ -6075,7 +6075,25 @@
           <w:i w:val="0"/>
           <w:sz w:val="24"/>
         </w:rPr>
-        <w:t>The model is compiled with the Adam optimizer (initial learning rate $\eta = 1 \times 10^{-3}$) and trained using sparse categorical cross-entropy loss. During inference, the raw softmax probabilities pass through an Operational Decision Policy: an acceptance threshold $\tau = 0.40$ combined with a 5-frame moving-average temporal smoothing window. If the highest class probability exceeds $\tau$, the state is declared `Accepted`; otherwise, the system transitions to `Uncertain` or `No-Sign`, preventing spurious classifications during transitions.</w:t>
+        <w:t>The model is compiled with the Adam optimizer (initial learning rate $\eta = 1 \times 10^{-3}$) and trained using sparse categorical cross-entropy loss. During inference, the raw softmax probabilities pass through an Operational Decision Policy: an accept threshold of 0.57 with a provisional floor of 0.00, combined with a 5-frame moving-average temporal smoothing window. Predictions at or above the accept threshold are declared `Recognized`; lower-confidence predictions are reported as `Provisional` or `Uncertain`, and the system returns `No-Sign` when no sign is present, preventing spurious classifications during transitions. `Provisional` and `Uncertain` are display-only states and are never automatically committed.</w:t>
+      </w:r>
+    </w:p>
+    <w:p>
+      <w:pPr>
+        <w:spacing w:before="0" w:after="120" w:line="360" w:lineRule="auto"/>
+        <w:jc w:val="both"/>
+      </w:pPr>
+      <w:r>
+        <w:rPr>
+          <w:rFonts w:ascii="Times New Roman" w:hAnsi="Times New Roman"/>
+          <w:b/>
+          <w:i w:val="0"/>
+          <w:sz w:val="24"/>
+        </w:rPr>
+        <w:t xml:space="preserve">Calibration and Decision Policy (M13). </w:t>
+      </w:r>
+      <w:r>
+        <w:t>The decision policy and its calibration were fitted exclusively on the validation partition (n = 2,397). Temperature calibration returned an identity transform (T = 1.0): the fit was rejected because the expected calibration error was already optimal at ECE 0.0283. The fitted policy applies an accept threshold of 0.57 with a provisional floor of 0.00 and a 5-frame smoothing window, yielding three display states — Recognized, Provisional and Uncertain — together with No-Sign when no sign is present. Under this policy, commit precision reaches 90.3% on validation at 82.0% coverage and 89.5% on the frozen test partition at 81.3% coverage, while the false-accept rate is reduced by 43% relative to the former 0.40 accept threshold. Provisional and Uncertain are display-only states and are never auto-committed.</w:t>
       </w:r>
     </w:p>
     <w:p>
@@ -6105,7 +6123,7 @@
           <w:i w:val="0"/>
           <w:sz w:val="24"/>
         </w:rPr>
-        <w:t>Upon confirming an `Accepted` prediction state, the predicted integer class index $c \in \{0, \dots, 49\}$ is mapped through the system class dictionary to its canonical textual label (e.g., 'Hello', 'Thank You', 'Doctor', 'Water'). The application interface implements an intelligent Sentence Accumulator: consecutive identical predictions are debounced using a temporal hysteresis filter to prevent word stuttering. As distinct signs are completed, words are sequentially accumulated into complete sentences with proper punctuation, displayed prominently on the live user interface.</w:t>
+        <w:t>Upon confirming a `Recognized` prediction state, the predicted integer class index $c \in \{0, \dots, 108\}$ is mapped through the system class dictionary to its canonical textual label (e.g., 'Hello', 'Thank You', 'Doctor', 'Water'). The application interface implements an intelligent Sentence Accumulator: consecutive identical predictions are debounced using a temporal hysteresis filter to prevent word stuttering. As distinct signs are completed, words are sequentially accumulated into complete sentences with proper punctuation, displayed prominently on the live user interface.</w:t>
       </w:r>
     </w:p>
     <w:p>
@@ -6165,7 +6183,7 @@
           <w:i w:val="0"/>
           <w:sz w:val="24"/>
         </w:rPr>
-        <w:t>2. Reverse Communication Channel (Hearing Individual to Signer): To make interaction truly two-way, the system includes a dedicated Text-to-Sign module (`POST /api/v1/speech/text-to-sign`). Hearing users can type or speak responses, which are parsed using a longest-phrase-first matching algorithm against the 50 ISL vocabulary classes. Matched signs immediately trigger visual video demonstrations and animated sign references, enabling the deaf user to understand the hearing user's reply.</w:t>
+        <w:t>2. Reverse Communication Channel (Hearing Individual to Signer): To make interaction truly two-way, the system includes a dedicated Text-to-Sign module (`POST /api/v1/speech/text-to-sign`). Hearing users can type or speak responses, which are parsed using a longest-phrase-first matching algorithm against the 109 ISL vocabulary classes. Matched signs immediately trigger visual video demonstrations and animated sign references, enabling the deaf user to understand the hearing user's reply.</w:t>
       </w:r>
     </w:p>
     <w:p>
@@ -6255,7 +6273,7 @@
         <w:t xml:space="preserve">• AI Inference &amp; Storage Tier: </w:t>
       </w:r>
       <w:r>
-        <w:t>Houses the Keras GRU candidate model (`SBAI-MDL-ISL-1.0.0.keras`), model registry (`registry.json`), SQLite/PostgreSQL relational database schemas for session audit trails, and curated ISL sign video dictionaries.</w:t>
+        <w:t>Houses the active deployed ensemble model (`models/SBAI-MDL-ISL-4.0.0.keras`), model registry (`registry.json`), SQLite/PostgreSQL relational database schemas for session audit trails, and curated ISL sign video dictionaries.</w:t>
       </w:r>
     </w:p>
     <w:p>
@@ -6699,7 +6717,7 @@
                 <w:rFonts w:ascii="Times New Roman" w:hAnsi="Times New Roman"/>
                 <w:sz w:val="20"/>
               </w:rPr>
-              <w:t>OpenCV 4.9.0, Google MediaPipe Holistic &amp; Tasks-Vision</w:t>
+              <w:t>OpenCV 4.10.0, Google MediaPipe Holistic &amp; Tasks-Vision</w:t>
             </w:r>
           </w:p>
         </w:tc>
@@ -7156,7 +7174,7 @@
                 <w:rFonts w:ascii="Times New Roman" w:hAnsi="Times New Roman"/>
                 <w:sz w:val="20"/>
               </w:rPr>
-              <w:t>Optional: NVIDIA GTX 1650+ / RTX series (CPU inference supported at 0.36 ms)</w:t>
+              <w:t>Optional: NVIDIA GTX 1650+ / RTX series (CPU inference supported at ≈0.3–0.4 s p50 per sign window)</w:t>
             </w:r>
           </w:p>
         </w:tc>
@@ -7239,7 +7257,7 @@
           <w:i w:val="0"/>
           <w:sz w:val="24"/>
         </w:rPr>
-        <w:t>Individual modules were verified through automated unit tests (Pytest for backend and Vitest for frontend), followed by end-to-end integration testing of the streaming pipeline:</w:t>
+        <w:t>Individual modules were verified through automated unit tests (Pytest for backend and Vitest for frontend), followed by end-to-end integration testing of the streaming pipeline. The final regression suites pass 123 backend (pytest) tests and 48 frontend (vitest) tests with a clean TypeScript check (tsc --noEmit):</w:t>
       </w:r>
     </w:p>
     <w:p>
@@ -7545,7 +7563,7 @@
           <w:i w:val="0"/>
           <w:sz w:val="24"/>
         </w:rPr>
-        <w:t>Experimental validation was conducted on a curated dataset comprising 7,438 sequences across 50 Indian Sign Language vocabulary classes. To enforce complete scientific rigor and eliminate potential data leakage, the dataset was partitioned under the signer-separated `SPLIT-1.0` protocol, where signers appearing in the test partition are strictly excluded from the training and validation sets.</w:t>
+        <w:t>Experimental validation was conducted on a curated dataset comprising 14,826 sequences across 109 Indian Sign Language vocabulary classes. To enforce complete scientific rigor and eliminate potential data leakage, the dataset was partitioned under the signer-separated `SPLIT-4.0` (SPLIT-109) protocol, where signers appearing in the test partition are strictly excluded from the training and validation sets.</w:t>
       </w:r>
     </w:p>
     <w:p>
@@ -7790,7 +7808,7 @@
                 <w:rFonts w:ascii="Times New Roman" w:hAnsi="Times New Roman"/>
                 <w:sz w:val="19"/>
               </w:rPr>
-              <w:t>4,697</w:t>
+              <w:t>8,800</w:t>
             </w:r>
           </w:p>
         </w:tc>
@@ -7813,7 +7831,7 @@
                 <w:rFonts w:ascii="Times New Roman" w:hAnsi="Times New Roman"/>
                 <w:sz w:val="19"/>
               </w:rPr>
-              <w:t>50</w:t>
+              <w:t>109</w:t>
             </w:r>
           </w:p>
         </w:tc>
@@ -7836,7 +7854,7 @@
                 <w:rFonts w:ascii="Times New Roman" w:hAnsi="Times New Roman"/>
                 <w:sz w:val="19"/>
               </w:rPr>
-              <w:t>88</w:t>
+              <w:t>74</w:t>
             </w:r>
           </w:p>
         </w:tc>
@@ -7859,7 +7877,7 @@
                 <w:rFonts w:ascii="Times New Roman" w:hAnsi="Times New Roman"/>
                 <w:sz w:val="19"/>
               </w:rPr>
-              <w:t>103</w:t>
+              <w:t>89</w:t>
             </w:r>
           </w:p>
         </w:tc>
@@ -7924,7 +7942,7 @@
                 <w:rFonts w:ascii="Times New Roman" w:hAnsi="Times New Roman"/>
                 <w:sz w:val="19"/>
               </w:rPr>
-              <w:t>1,091</w:t>
+              <w:t>2,397</w:t>
             </w:r>
           </w:p>
         </w:tc>
@@ -7947,7 +7965,7 @@
                 <w:rFonts w:ascii="Times New Roman" w:hAnsi="Times New Roman"/>
                 <w:sz w:val="19"/>
               </w:rPr>
-              <w:t>50</w:t>
+              <w:t>109</w:t>
             </w:r>
           </w:p>
         </w:tc>
@@ -7993,7 +8011,7 @@
                 <w:rFonts w:ascii="Times New Roman" w:hAnsi="Times New Roman"/>
                 <w:sz w:val="19"/>
               </w:rPr>
-              <w:t>23</w:t>
+              <w:t>25</w:t>
             </w:r>
           </w:p>
         </w:tc>
@@ -8058,7 +8076,7 @@
                 <w:rFonts w:ascii="Times New Roman" w:hAnsi="Times New Roman"/>
                 <w:sz w:val="19"/>
               </w:rPr>
-              <w:t>1,650</w:t>
+              <w:t>3,629</w:t>
             </w:r>
           </w:p>
         </w:tc>
@@ -8081,7 +8099,7 @@
                 <w:rFonts w:ascii="Times New Roman" w:hAnsi="Times New Roman"/>
                 <w:sz w:val="19"/>
               </w:rPr>
-              <w:t>50</w:t>
+              <w:t>109</w:t>
             </w:r>
           </w:p>
         </w:tc>
@@ -8145,7 +8163,7 @@
           <w:i w:val="0"/>
           <w:sz w:val="24"/>
         </w:rPr>
-        <w:t>On the frozen, signer-disjoint test partition of 1,650 samples across 50 classes, the candidate model `SBAI-MDL-ISL-1.0.0` (GRU) achieved the following empirical performance metrics:</w:t>
+        <w:t>On the frozen, signer-disjoint test partition of 3,629 samples across 109 classes, the active deployed model `SBAI-MDL-ISL-4.0.0` (a three-way LSTM+GRU+mirror-TTA ensemble) achieved the following empirical performance metrics:</w:t>
       </w:r>
     </w:p>
     <w:p>
@@ -8163,7 +8181,7 @@
         <w:rPr>
           <w:b/>
         </w:rPr>
-        <w:t>82.42% (0.8242)</w:t>
+        <w:t>81.29% (0.812896)</w:t>
       </w:r>
     </w:p>
     <w:p>
@@ -8181,7 +8199,7 @@
         <w:rPr>
           <w:b/>
         </w:rPr>
-        <w:t>83.24% (0.8324)</w:t>
+        <w:t>81.90% (0.818957)</w:t>
       </w:r>
     </w:p>
     <w:p>
@@ -8199,7 +8217,7 @@
         <w:rPr>
           <w:b/>
         </w:rPr>
-        <w:t>82.36% (0.8236)</w:t>
+        <w:t>81.22% (0.812188)</w:t>
       </w:r>
     </w:p>
     <w:p>
@@ -8217,7 +8235,7 @@
         <w:rPr>
           <w:b/>
         </w:rPr>
-        <w:t>82.30% (0.8230)</w:t>
+        <w:t>80.79% (0.807865)</w:t>
       </w:r>
     </w:p>
     <w:p>
@@ -8235,7 +8253,7 @@
         <w:rPr>
           <w:b/>
         </w:rPr>
-        <w:t>0.36 milliseconds per sample (~2,777 FPS processing capability)</w:t>
+        <w:t>p50 374.85 ms / p95 575.22 ms per sign window (windows-aware ensemble probe, CPU)</w:t>
       </w:r>
     </w:p>
     <w:p>
@@ -8247,13 +8265,31 @@
         <w:rPr>
           <w:b/>
         </w:rPr>
-        <w:t xml:space="preserve">• Validation Accepted Accuracy: </w:t>
+        <w:t xml:space="preserve">• Decision-Policy Commit Precision and Calibration: </w:t>
       </w:r>
       <w:r>
         <w:rPr>
           <w:b/>
         </w:rPr>
-        <w:t>85.03% (at 99.18% coverage under threshold tau=0.40 and smoothing window W=5)</w:t>
+        <w:t>VAL 90.34% precision at 82.02% coverage (TEST 89.53% at 81.32%) under accept 0.57 / provisional 0.00 with smoothing window W=5; temperature T=1.0 (fit rejected), ECE 0.028 (VAL) / 0.022 (TEST)</w:t>
+      </w:r>
+    </w:p>
+    <w:p>
+      <w:pPr>
+        <w:spacing w:before="0" w:after="120" w:line="360" w:lineRule="auto"/>
+        <w:jc w:val="both"/>
+      </w:pPr>
+      <w:r>
+        <w:rPr>
+          <w:rFonts w:ascii="Times New Roman" w:hAnsi="Times New Roman"/>
+          <w:b/>
+          <w:i w:val="0"/>
+          <w:sz w:val="24"/>
+        </w:rPr>
+        <w:t xml:space="preserve">Model Versioning and Promotion Gates. </w:t>
+      </w:r>
+      <w:r>
+        <w:t>The deployed model lineage is version 1.0.0 (the MVP-era system with a 50-sign vocabulary that this report originally described), version 2.0.0 (a 100-class synthetic-trained stub that scored 1.0 on its synthetic test but never cleared the production gates), version 3.0.0 (100-class real data; frozen test accuracy 0.8109 and macro F1 0.8062 on n = 3,326; milestone M10), and version 4.0.0 (109-class real data; frozen test accuracy 0.8129 and macro F1 0.8079 on n = 3,629; milestone M11), which is the currently active model. A version 4.1.0 candidate (time-jitter augmentation for the GRU branch) failed its promotion gates — validation macro-F1 0.8143 against a required 0.828963 and validation accuracy 0.8169 against a required 0.833125 — and was discarded, preserving 4.0.0 with backups at `models/_backup_4.0.0_pretrain/` and `data/dataset/_backup_pretrain/`. A three-window test-time-augmentation variant was also evaluated and failed its gate (accuracy change −0.0359 against a required ≥ +0.010, and p95 latency 371.65 ms against a ≤ 300 ms budget), so `tta_windows` remains 1 (disabled).</w:t>
       </w:r>
     </w:p>
     <w:p>
@@ -8307,7 +8343,7 @@
           <w:b/>
           <w:sz w:val="20"/>
         </w:rPr>
-        <w:t>Figure 5.5: Deep Learning Model Training and Validation Convergence over 75 Epochs</w:t>
+        <w:t>Figure 5.5: Deep Learning Model Training and Validation Convergence over 130 (LSTM) / 94 (GRU) Epochs</w:t>
       </w:r>
     </w:p>
     <w:p>
@@ -8361,7 +8397,7 @@
           <w:b/>
           <w:sz w:val="20"/>
         </w:rPr>
-        <w:t>Figure 5.6: Class-Wise F1-Score Distribution across 50 Indian Sign Language Classes</w:t>
+        <w:t>Figure 5.6: Class-Wise F1-Score Distribution across 109 Indian Sign Language Classes</w:t>
       </w:r>
     </w:p>
     <w:p>
@@ -8376,7 +8412,7 @@
           <w:i w:val="0"/>
           <w:sz w:val="24"/>
         </w:rPr>
-        <w:t>To establish architectural superiority, a baseline LSTM model with identical hidden unit capacities was evaluated on the identical test split. As detailed in Table 5.2, the proposed GRU model outperforms the baseline LSTM across every evaluation metric.</w:t>
+        <w:t>To establish architectural superiority, single-model challenger architectures were evaluated on the identical test split: the baseline LSTM with identical hidden unit capacities attained 75.67% accuracy and 75.06% macro F1, and the GRU challenger attained 80.57% accuracy and 80.12% macro F1. As detailed in Table 5.2, the deployed three-way ensemble leads both challengers on accuracy, macro precision and macro F1 (81.29% / 81.90% / 80.79%), trading a higher per-window inference latency for that accuracy gain.</w:t>
       </w:r>
     </w:p>
     <w:p>
@@ -8604,7 +8640,7 @@
                 <w:rFonts w:ascii="Times New Roman" w:hAnsi="Times New Roman"/>
                 <w:sz w:val="19"/>
               </w:rPr>
-              <w:t>1,650</w:t>
+              <w:t>3,629</w:t>
             </w:r>
           </w:p>
         </w:tc>
@@ -8627,7 +8663,7 @@
                 <w:rFonts w:ascii="Times New Roman" w:hAnsi="Times New Roman"/>
                 <w:sz w:val="19"/>
               </w:rPr>
-              <w:t>77.27%</w:t>
+              <w:t>75.67%</w:t>
             </w:r>
           </w:p>
         </w:tc>
@@ -8650,7 +8686,7 @@
                 <w:rFonts w:ascii="Times New Roman" w:hAnsi="Times New Roman"/>
                 <w:sz w:val="19"/>
               </w:rPr>
-              <w:t>78.45%</w:t>
+              <w:t>76.45%</w:t>
             </w:r>
           </w:p>
         </w:tc>
@@ -8673,7 +8709,7 @@
                 <w:rFonts w:ascii="Times New Roman" w:hAnsi="Times New Roman"/>
                 <w:sz w:val="19"/>
               </w:rPr>
-              <w:t>76.36%</w:t>
+              <w:t>75.06%</w:t>
             </w:r>
           </w:p>
         </w:tc>
@@ -8696,7 +8732,7 @@
                 <w:rFonts w:ascii="Times New Roman" w:hAnsi="Times New Roman"/>
                 <w:sz w:val="19"/>
               </w:rPr>
-              <w:t>0.37 ms</w:t>
+              <w:t>61.86 ms</w:t>
             </w:r>
           </w:p>
         </w:tc>
@@ -8745,7 +8781,7 @@
                 <w:b/>
                 <w:sz w:val="19"/>
               </w:rPr>
-              <w:t>1,650</w:t>
+              <w:t>3,629</w:t>
             </w:r>
           </w:p>
         </w:tc>
@@ -8770,7 +8806,7 @@
                 <w:b/>
                 <w:sz w:val="19"/>
               </w:rPr>
-              <w:t>82.42%</w:t>
+              <w:t>80.57%</w:t>
             </w:r>
           </w:p>
         </w:tc>
@@ -8795,7 +8831,7 @@
                 <w:b/>
                 <w:sz w:val="19"/>
               </w:rPr>
-              <w:t>83.24%</w:t>
+              <w:t>81.24%</w:t>
             </w:r>
           </w:p>
         </w:tc>
@@ -8820,7 +8856,7 @@
                 <w:b/>
                 <w:sz w:val="19"/>
               </w:rPr>
-              <w:t>82.30%</w:t>
+              <w:t>80.12%</w:t>
             </w:r>
           </w:p>
         </w:tc>
@@ -8845,12 +8881,838 @@
                 <w:b/>
                 <w:sz w:val="19"/>
               </w:rPr>
-              <w:t>0.36 ms</w:t>
+              <w:t>64.4 ms</w:t>
+            </w:r>
+          </w:p>
+        </w:tc>
+      </w:tr>
+      <w:tr>
+        <w:tc>
+          <w:tcPr>
+            <w:tcW w:type="dxa" w:w="1500"/>
+            <w:shd w:fill="F0FDF4"/>
+            <w:tcMar>
+              <w:top w:w="60" w:type="dxa"/>
+              <w:bottom w:w="60" w:type="dxa"/>
+              <w:left w:w="60" w:type="dxa"/>
+              <w:right w:w="60" w:type="dxa"/>
+            </w:tcMar>
+          </w:tcPr>
+          <w:p>
+            <w:r>
+              <w:rPr>
+                <w:rFonts w:ascii="Times New Roman" w:hAnsi="Times New Roman"/>
+                <w:b/>
+                <w:sz w:val="19"/>
+              </w:rPr>
+              <w:t>Deployed ensemble (LSTM+GRU+mirror-TTA)</w:t>
+            </w:r>
+          </w:p>
+        </w:tc>
+        <w:tc>
+          <w:tcPr>
+            <w:tcW w:type="dxa" w:w="1500"/>
+            <w:shd w:fill="F0FDF4"/>
+            <w:tcMar>
+              <w:top w:w="60" w:type="dxa"/>
+              <w:bottom w:w="60" w:type="dxa"/>
+              <w:left w:w="60" w:type="dxa"/>
+              <w:right w:w="60" w:type="dxa"/>
+            </w:tcMar>
+          </w:tcPr>
+          <w:p>
+            <w:pPr>
+              <w:jc w:val="center"/>
+            </w:pPr>
+            <w:r>
+              <w:rPr>
+                <w:rFonts w:ascii="Times New Roman" w:hAnsi="Times New Roman"/>
+                <w:b/>
+                <w:sz w:val="19"/>
+              </w:rPr>
+              <w:t>3,629</w:t>
+            </w:r>
+          </w:p>
+        </w:tc>
+        <w:tc>
+          <w:tcPr>
+            <w:tcW w:type="dxa" w:w="1500"/>
+            <w:shd w:fill="F0FDF4"/>
+            <w:tcMar>
+              <w:top w:w="60" w:type="dxa"/>
+              <w:bottom w:w="60" w:type="dxa"/>
+              <w:left w:w="60" w:type="dxa"/>
+              <w:right w:w="60" w:type="dxa"/>
+            </w:tcMar>
+          </w:tcPr>
+          <w:p>
+            <w:pPr>
+              <w:jc w:val="center"/>
+            </w:pPr>
+            <w:r>
+              <w:rPr>
+                <w:rFonts w:ascii="Times New Roman" w:hAnsi="Times New Roman"/>
+                <w:b/>
+                <w:sz w:val="19"/>
+              </w:rPr>
+              <w:t>81.29%</w:t>
+            </w:r>
+          </w:p>
+        </w:tc>
+        <w:tc>
+          <w:tcPr>
+            <w:tcW w:type="dxa" w:w="1500"/>
+            <w:shd w:fill="F0FDF4"/>
+            <w:tcMar>
+              <w:top w:w="60" w:type="dxa"/>
+              <w:bottom w:w="60" w:type="dxa"/>
+              <w:left w:w="60" w:type="dxa"/>
+              <w:right w:w="60" w:type="dxa"/>
+            </w:tcMar>
+          </w:tcPr>
+          <w:p>
+            <w:pPr>
+              <w:jc w:val="center"/>
+            </w:pPr>
+            <w:r>
+              <w:rPr>
+                <w:rFonts w:ascii="Times New Roman" w:hAnsi="Times New Roman"/>
+                <w:b/>
+                <w:sz w:val="19"/>
+              </w:rPr>
+              <w:t>81.90%</w:t>
+            </w:r>
+          </w:p>
+        </w:tc>
+        <w:tc>
+          <w:tcPr>
+            <w:tcW w:type="dxa" w:w="1500"/>
+            <w:shd w:fill="F0FDF4"/>
+            <w:tcMar>
+              <w:top w:w="60" w:type="dxa"/>
+              <w:bottom w:w="60" w:type="dxa"/>
+              <w:left w:w="60" w:type="dxa"/>
+              <w:right w:w="60" w:type="dxa"/>
+            </w:tcMar>
+          </w:tcPr>
+          <w:p>
+            <w:pPr>
+              <w:jc w:val="center"/>
+            </w:pPr>
+            <w:r>
+              <w:rPr>
+                <w:rFonts w:ascii="Times New Roman" w:hAnsi="Times New Roman"/>
+                <w:b/>
+                <w:sz w:val="19"/>
+              </w:rPr>
+              <w:t>80.79%</w:t>
+            </w:r>
+          </w:p>
+        </w:tc>
+        <w:tc>
+          <w:tcPr>
+            <w:tcW w:type="dxa" w:w="1500"/>
+            <w:shd w:fill="F0FDF4"/>
+            <w:tcMar>
+              <w:top w:w="60" w:type="dxa"/>
+              <w:bottom w:w="60" w:type="dxa"/>
+              <w:left w:w="60" w:type="dxa"/>
+              <w:right w:w="60" w:type="dxa"/>
+            </w:tcMar>
+          </w:tcPr>
+          <w:p>
+            <w:pPr>
+              <w:jc w:val="center"/>
+            </w:pPr>
+            <w:r>
+              <w:rPr>
+                <w:rFonts w:ascii="Times New Roman" w:hAnsi="Times New Roman"/>
+                <w:b/>
+                <w:sz w:val="19"/>
+              </w:rPr>
+              <w:t>~375 ms p50</w:t>
             </w:r>
           </w:p>
         </w:tc>
       </w:tr>
     </w:tbl>
+    <w:p>
+      <w:pPr>
+        <w:spacing w:before="280" w:after="80" w:line="276" w:lineRule="auto"/>
+        <w:jc w:val="left"/>
+      </w:pPr>
+      <w:r>
+        <w:rPr>
+          <w:rFonts w:ascii="Times New Roman" w:hAnsi="Times New Roman"/>
+          <w:b/>
+          <w:i w:val="0"/>
+          <w:sz w:val="24"/>
+        </w:rPr>
+        <w:t>Webcam-Domain Evaluation</w:t>
+      </w:r>
+    </w:p>
+    <w:p>
+      <w:pPr>
+        <w:spacing w:before="0" w:after="120" w:line="360" w:lineRule="auto"/>
+        <w:jc w:val="both"/>
+      </w:pPr>
+      <w:r>
+        <w:rPr>
+          <w:rFonts w:ascii="Times New Roman" w:hAnsi="Times New Roman"/>
+          <w:b w:val="0"/>
+          <w:i w:val="0"/>
+          <w:sz w:val="24"/>
+        </w:rPr>
+        <w:t>Because deployed accuracy must ultimately be measured through a camera, a webcam-domain evaluation was performed as an offline replay proxy over 1,500 frozen-test clips at the accept threshold of 0.57. The four replay conditions are summarised below in terms of accuracy, acceptance rate and visible-correct rate:</w:t>
+      </w:r>
+    </w:p>
+    <w:tbl>
+      <w:tblPr>
+        <w:tblW w:type="auto" w:w="0"/>
+        <w:jc w:val="center"/>
+        <w:tblLook w:firstColumn="1" w:firstRow="1" w:lastColumn="0" w:lastRow="0" w:noHBand="0" w:noVBand="1" w:val="04A0"/>
+        <w:tblBorders>
+          <w:top w:val="single" w:sz="4" w:space="0" w:color="CCCCCC"/>
+          <w:bottom w:val="single" w:sz="4" w:space="0" w:color="CCCCCC"/>
+          <w:left w:val="none"/>
+          <w:right w:val="none"/>
+          <w:insideH w:val="single" w:sz="4" w:space="0" w:color="CCCCCC"/>
+          <w:insideV w:val="none"/>
+        </w:tblBorders>
+      </w:tblPr>
+      <w:tblGrid>
+        <w:gridCol w:w="2700"/>
+        <w:gridCol w:w="1500"/>
+        <w:gridCol w:w="1500"/>
+        <w:gridCol w:w="1650"/>
+        <w:gridCol w:w="1650"/>
+      </w:tblGrid>
+      <w:tr>
+        <w:tc>
+          <w:tcPr>
+            <w:tcW w:type="dxa" w:w="2700"/>
+            <w:shd w:fill="E8EFF7"/>
+            <w:tcMar>
+              <w:top w:w="60" w:type="dxa"/>
+              <w:bottom w:w="60" w:type="dxa"/>
+              <w:left w:w="60" w:type="dxa"/>
+              <w:right w:w="60" w:type="dxa"/>
+            </w:tcMar>
+          </w:tcPr>
+          <w:p>
+            <w:r>
+              <w:rPr>
+                <w:rFonts w:ascii="Times New Roman" w:hAnsi="Times New Roman"/>
+                <w:b/>
+                <w:sz w:val="19"/>
+              </w:rPr>
+              <w:t>Condition</w:t>
+            </w:r>
+          </w:p>
+        </w:tc>
+        <w:tc>
+          <w:tcPr>
+            <w:tcW w:type="dxa" w:w="1500"/>
+            <w:shd w:fill="E8EFF7"/>
+            <w:tcMar>
+              <w:top w:w="60" w:type="dxa"/>
+              <w:bottom w:w="60" w:type="dxa"/>
+              <w:left w:w="60" w:type="dxa"/>
+              <w:right w:w="60" w:type="dxa"/>
+            </w:tcMar>
+          </w:tcPr>
+          <w:p>
+            <w:pPr>
+              <w:jc w:val="center"/>
+            </w:pPr>
+            <w:r>
+              <w:rPr>
+                <w:rFonts w:ascii="Times New Roman" w:hAnsi="Times New Roman"/>
+                <w:b/>
+                <w:sz w:val="19"/>
+              </w:rPr>
+              <w:t>Samples (n)</w:t>
+            </w:r>
+          </w:p>
+        </w:tc>
+        <w:tc>
+          <w:tcPr>
+            <w:tcW w:type="dxa" w:w="1500"/>
+            <w:shd w:fill="E8EFF7"/>
+            <w:tcMar>
+              <w:top w:w="60" w:type="dxa"/>
+              <w:bottom w:w="60" w:type="dxa"/>
+              <w:left w:w="60" w:type="dxa"/>
+              <w:right w:w="60" w:type="dxa"/>
+            </w:tcMar>
+          </w:tcPr>
+          <w:p>
+            <w:pPr>
+              <w:jc w:val="center"/>
+            </w:pPr>
+            <w:r>
+              <w:rPr>
+                <w:rFonts w:ascii="Times New Roman" w:hAnsi="Times New Roman"/>
+                <w:b/>
+                <w:sz w:val="19"/>
+              </w:rPr>
+              <w:t>Accuracy</w:t>
+            </w:r>
+          </w:p>
+        </w:tc>
+        <w:tc>
+          <w:tcPr>
+            <w:tcW w:type="dxa" w:w="1650"/>
+            <w:shd w:fill="E8EFF7"/>
+            <w:tcMar>
+              <w:top w:w="60" w:type="dxa"/>
+              <w:bottom w:w="60" w:type="dxa"/>
+              <w:left w:w="60" w:type="dxa"/>
+              <w:right w:w="60" w:type="dxa"/>
+            </w:tcMar>
+          </w:tcPr>
+          <w:p>
+            <w:pPr>
+              <w:jc w:val="center"/>
+            </w:pPr>
+            <w:r>
+              <w:rPr>
+                <w:rFonts w:ascii="Times New Roman" w:hAnsi="Times New Roman"/>
+                <w:b/>
+                <w:sz w:val="19"/>
+              </w:rPr>
+              <w:t>Accept Rate @ 0.57</w:t>
+            </w:r>
+          </w:p>
+        </w:tc>
+        <w:tc>
+          <w:tcPr>
+            <w:tcW w:type="dxa" w:w="1650"/>
+            <w:shd w:fill="E8EFF7"/>
+            <w:tcMar>
+              <w:top w:w="60" w:type="dxa"/>
+              <w:bottom w:w="60" w:type="dxa"/>
+              <w:left w:w="60" w:type="dxa"/>
+              <w:right w:w="60" w:type="dxa"/>
+            </w:tcMar>
+          </w:tcPr>
+          <w:p>
+            <w:pPr>
+              <w:jc w:val="center"/>
+            </w:pPr>
+            <w:r>
+              <w:rPr>
+                <w:rFonts w:ascii="Times New Roman" w:hAnsi="Times New Roman"/>
+                <w:b/>
+                <w:sz w:val="19"/>
+              </w:rPr>
+              <w:t>Visible-Correct</w:t>
+            </w:r>
+          </w:p>
+        </w:tc>
+      </w:tr>
+      <w:tr>
+        <w:tc>
+          <w:tcPr>
+            <w:tcW w:type="dxa" w:w="2700"/>
+            <w:tcMar>
+              <w:top w:w="60" w:type="dxa"/>
+              <w:bottom w:w="60" w:type="dxa"/>
+              <w:left w:w="60" w:type="dxa"/>
+              <w:right w:w="60" w:type="dxa"/>
+            </w:tcMar>
+          </w:tcPr>
+          <w:p>
+            <w:r>
+              <w:rPr>
+                <w:rFonts w:ascii="Times New Roman" w:hAnsi="Times New Roman"/>
+                <w:sz w:val="19"/>
+              </w:rPr>
+              <w:t>full_sign</w:t>
+            </w:r>
+          </w:p>
+        </w:tc>
+        <w:tc>
+          <w:tcPr>
+            <w:tcW w:type="dxa" w:w="1500"/>
+            <w:tcMar>
+              <w:top w:w="60" w:type="dxa"/>
+              <w:bottom w:w="60" w:type="dxa"/>
+              <w:left w:w="60" w:type="dxa"/>
+              <w:right w:w="60" w:type="dxa"/>
+            </w:tcMar>
+          </w:tcPr>
+          <w:p>
+            <w:pPr>
+              <w:jc w:val="center"/>
+            </w:pPr>
+            <w:r>
+              <w:rPr>
+                <w:rFonts w:ascii="Times New Roman" w:hAnsi="Times New Roman"/>
+                <w:sz w:val="19"/>
+              </w:rPr>
+              <w:t>1,500</w:t>
+            </w:r>
+          </w:p>
+        </w:tc>
+        <w:tc>
+          <w:tcPr>
+            <w:tcW w:type="dxa" w:w="1500"/>
+            <w:tcMar>
+              <w:top w:w="60" w:type="dxa"/>
+              <w:bottom w:w="60" w:type="dxa"/>
+              <w:left w:w="60" w:type="dxa"/>
+              <w:right w:w="60" w:type="dxa"/>
+            </w:tcMar>
+          </w:tcPr>
+          <w:p>
+            <w:pPr>
+              <w:jc w:val="center"/>
+            </w:pPr>
+            <w:r>
+              <w:rPr>
+                <w:rFonts w:ascii="Times New Roman" w:hAnsi="Times New Roman"/>
+                <w:sz w:val="19"/>
+              </w:rPr>
+              <w:t>0.822</w:t>
+            </w:r>
+          </w:p>
+        </w:tc>
+        <w:tc>
+          <w:tcPr>
+            <w:tcW w:type="dxa" w:w="1650"/>
+            <w:tcMar>
+              <w:top w:w="60" w:type="dxa"/>
+              <w:bottom w:w="60" w:type="dxa"/>
+              <w:left w:w="60" w:type="dxa"/>
+              <w:right w:w="60" w:type="dxa"/>
+            </w:tcMar>
+          </w:tcPr>
+          <w:p>
+            <w:pPr>
+              <w:jc w:val="center"/>
+            </w:pPr>
+            <w:r>
+              <w:rPr>
+                <w:rFonts w:ascii="Times New Roman" w:hAnsi="Times New Roman"/>
+                <w:sz w:val="19"/>
+              </w:rPr>
+              <w:t>0.813</w:t>
+            </w:r>
+          </w:p>
+        </w:tc>
+        <w:tc>
+          <w:tcPr>
+            <w:tcW w:type="dxa" w:w="1650"/>
+            <w:tcMar>
+              <w:top w:w="60" w:type="dxa"/>
+              <w:bottom w:w="60" w:type="dxa"/>
+              <w:left w:w="60" w:type="dxa"/>
+              <w:right w:w="60" w:type="dxa"/>
+            </w:tcMar>
+          </w:tcPr>
+          <w:p>
+            <w:pPr>
+              <w:jc w:val="center"/>
+            </w:pPr>
+            <w:r>
+              <w:rPr>
+                <w:rFonts w:ascii="Times New Roman" w:hAnsi="Times New Roman"/>
+                <w:sz w:val="19"/>
+              </w:rPr>
+              <w:t>0.736</w:t>
+            </w:r>
+          </w:p>
+        </w:tc>
+      </w:tr>
+      <w:tr>
+        <w:tc>
+          <w:tcPr>
+            <w:tcW w:type="dxa" w:w="2700"/>
+            <w:shd w:fill="F0FDF4"/>
+            <w:tcMar>
+              <w:top w:w="60" w:type="dxa"/>
+              <w:bottom w:w="60" w:type="dxa"/>
+              <w:left w:w="60" w:type="dxa"/>
+              <w:right w:w="60" w:type="dxa"/>
+            </w:tcMar>
+          </w:tcPr>
+          <w:p>
+            <w:r>
+              <w:rPr>
+                <w:rFonts w:ascii="Times New Roman" w:hAnsi="Times New Roman"/>
+                <w:b/>
+                <w:sz w:val="19"/>
+              </w:rPr>
+              <w:t>idle_realistic</w:t>
+            </w:r>
+          </w:p>
+        </w:tc>
+        <w:tc>
+          <w:tcPr>
+            <w:tcW w:type="dxa" w:w="1500"/>
+            <w:shd w:fill="F0FDF4"/>
+            <w:tcMar>
+              <w:top w:w="60" w:type="dxa"/>
+              <w:bottom w:w="60" w:type="dxa"/>
+              <w:left w:w="60" w:type="dxa"/>
+              <w:right w:w="60" w:type="dxa"/>
+            </w:tcMar>
+          </w:tcPr>
+          <w:p>
+            <w:pPr>
+              <w:jc w:val="center"/>
+            </w:pPr>
+            <w:r>
+              <w:rPr>
+                <w:rFonts w:ascii="Times New Roman" w:hAnsi="Times New Roman"/>
+                <w:b/>
+                <w:sz w:val="19"/>
+              </w:rPr>
+              <w:t>1,500</w:t>
+            </w:r>
+          </w:p>
+        </w:tc>
+        <w:tc>
+          <w:tcPr>
+            <w:tcW w:type="dxa" w:w="1500"/>
+            <w:shd w:fill="F0FDF4"/>
+            <w:tcMar>
+              <w:top w:w="60" w:type="dxa"/>
+              <w:bottom w:w="60" w:type="dxa"/>
+              <w:left w:w="60" w:type="dxa"/>
+              <w:right w:w="60" w:type="dxa"/>
+            </w:tcMar>
+          </w:tcPr>
+          <w:p>
+            <w:pPr>
+              <w:jc w:val="center"/>
+            </w:pPr>
+            <w:r>
+              <w:rPr>
+                <w:rFonts w:ascii="Times New Roman" w:hAnsi="Times New Roman"/>
+                <w:b/>
+                <w:sz w:val="19"/>
+              </w:rPr>
+              <w:t>0.769</w:t>
+            </w:r>
+          </w:p>
+        </w:tc>
+        <w:tc>
+          <w:tcPr>
+            <w:tcW w:type="dxa" w:w="1650"/>
+            <w:shd w:fill="F0FDF4"/>
+            <w:tcMar>
+              <w:top w:w="60" w:type="dxa"/>
+              <w:bottom w:w="60" w:type="dxa"/>
+              <w:left w:w="60" w:type="dxa"/>
+              <w:right w:w="60" w:type="dxa"/>
+            </w:tcMar>
+          </w:tcPr>
+          <w:p>
+            <w:pPr>
+              <w:jc w:val="center"/>
+            </w:pPr>
+            <w:r>
+              <w:rPr>
+                <w:rFonts w:ascii="Times New Roman" w:hAnsi="Times New Roman"/>
+                <w:b/>
+                <w:sz w:val="19"/>
+              </w:rPr>
+              <w:t>0.759</w:t>
+            </w:r>
+          </w:p>
+        </w:tc>
+        <w:tc>
+          <w:tcPr>
+            <w:tcW w:type="dxa" w:w="1650"/>
+            <w:shd w:fill="F0FDF4"/>
+            <w:tcMar>
+              <w:top w:w="60" w:type="dxa"/>
+              <w:bottom w:w="60" w:type="dxa"/>
+              <w:left w:w="60" w:type="dxa"/>
+              <w:right w:w="60" w:type="dxa"/>
+            </w:tcMar>
+          </w:tcPr>
+          <w:p>
+            <w:pPr>
+              <w:jc w:val="center"/>
+            </w:pPr>
+            <w:r>
+              <w:rPr>
+                <w:rFonts w:ascii="Times New Roman" w:hAnsi="Times New Roman"/>
+                <w:b/>
+                <w:sz w:val="19"/>
+              </w:rPr>
+              <w:t>0.664</w:t>
+            </w:r>
+          </w:p>
+        </w:tc>
+      </w:tr>
+      <w:tr>
+        <w:tc>
+          <w:tcPr>
+            <w:tcW w:type="dxa" w:w="2700"/>
+            <w:shd w:fill="F0FDF4"/>
+            <w:tcMar>
+              <w:top w:w="60" w:type="dxa"/>
+              <w:bottom w:w="60" w:type="dxa"/>
+              <w:left w:w="60" w:type="dxa"/>
+              <w:right w:w="60" w:type="dxa"/>
+            </w:tcMar>
+          </w:tcPr>
+          <w:p>
+            <w:r>
+              <w:rPr>
+                <w:rFonts w:ascii="Times New Roman" w:hAnsi="Times New Roman"/>
+                <w:b/>
+                <w:sz w:val="19"/>
+              </w:rPr>
+              <w:t>old_45_center (legacy ≈0.75 s window)</w:t>
+            </w:r>
+          </w:p>
+        </w:tc>
+        <w:tc>
+          <w:tcPr>
+            <w:tcW w:type="dxa" w:w="1500"/>
+            <w:shd w:fill="F0FDF4"/>
+            <w:tcMar>
+              <w:top w:w="60" w:type="dxa"/>
+              <w:bottom w:w="60" w:type="dxa"/>
+              <w:left w:w="60" w:type="dxa"/>
+              <w:right w:w="60" w:type="dxa"/>
+            </w:tcMar>
+          </w:tcPr>
+          <w:p>
+            <w:pPr>
+              <w:jc w:val="center"/>
+            </w:pPr>
+            <w:r>
+              <w:rPr>
+                <w:rFonts w:ascii="Times New Roman" w:hAnsi="Times New Roman"/>
+                <w:b/>
+                <w:sz w:val="19"/>
+              </w:rPr>
+              <w:t>1,500</w:t>
+            </w:r>
+          </w:p>
+        </w:tc>
+        <w:tc>
+          <w:tcPr>
+            <w:tcW w:type="dxa" w:w="1500"/>
+            <w:shd w:fill="F0FDF4"/>
+            <w:tcMar>
+              <w:top w:w="60" w:type="dxa"/>
+              <w:bottom w:w="60" w:type="dxa"/>
+              <w:left w:w="60" w:type="dxa"/>
+              <w:right w:w="60" w:type="dxa"/>
+            </w:tcMar>
+          </w:tcPr>
+          <w:p>
+            <w:pPr>
+              <w:jc w:val="center"/>
+            </w:pPr>
+            <w:r>
+              <w:rPr>
+                <w:rFonts w:ascii="Times New Roman" w:hAnsi="Times New Roman"/>
+                <w:b/>
+                <w:sz w:val="19"/>
+              </w:rPr>
+              <w:t>0.475</w:t>
+            </w:r>
+          </w:p>
+        </w:tc>
+        <w:tc>
+          <w:tcPr>
+            <w:tcW w:type="dxa" w:w="1650"/>
+            <w:shd w:fill="F0FDF4"/>
+            <w:tcMar>
+              <w:top w:w="60" w:type="dxa"/>
+              <w:bottom w:w="60" w:type="dxa"/>
+              <w:left w:w="60" w:type="dxa"/>
+              <w:right w:w="60" w:type="dxa"/>
+            </w:tcMar>
+          </w:tcPr>
+          <w:p>
+            <w:pPr>
+              <w:jc w:val="center"/>
+            </w:pPr>
+            <w:r>
+              <w:rPr>
+                <w:rFonts w:ascii="Times New Roman" w:hAnsi="Times New Roman"/>
+                <w:b/>
+                <w:sz w:val="19"/>
+              </w:rPr>
+              <w:t>0.439</w:t>
+            </w:r>
+          </w:p>
+        </w:tc>
+        <w:tc>
+          <w:tcPr>
+            <w:tcW w:type="dxa" w:w="1650"/>
+            <w:shd w:fill="F0FDF4"/>
+            <w:tcMar>
+              <w:top w:w="60" w:type="dxa"/>
+              <w:bottom w:w="60" w:type="dxa"/>
+              <w:left w:w="60" w:type="dxa"/>
+              <w:right w:w="60" w:type="dxa"/>
+            </w:tcMar>
+          </w:tcPr>
+          <w:p>
+            <w:pPr>
+              <w:jc w:val="center"/>
+            </w:pPr>
+            <w:r>
+              <w:rPr>
+                <w:rFonts w:ascii="Times New Roman" w:hAnsi="Times New Roman"/>
+                <w:b/>
+                <w:sz w:val="19"/>
+              </w:rPr>
+              <w:t>0.303</w:t>
+            </w:r>
+          </w:p>
+        </w:tc>
+      </w:tr>
+      <w:tr>
+        <w:tc>
+          <w:tcPr>
+            <w:tcW w:type="dxa" w:w="2700"/>
+            <w:shd w:fill="F0FDF4"/>
+            <w:tcMar>
+              <w:top w:w="60" w:type="dxa"/>
+              <w:bottom w:w="60" w:type="dxa"/>
+              <w:left w:w="60" w:type="dxa"/>
+              <w:right w:w="60" w:type="dxa"/>
+            </w:tcMar>
+          </w:tcPr>
+          <w:p>
+            <w:r>
+              <w:rPr>
+                <w:rFonts w:ascii="Times New Roman" w:hAnsi="Times New Roman"/>
+                <w:b/>
+                <w:sz w:val="19"/>
+              </w:rPr>
+              <w:t>old_rafdup (60 Hz rAF over 30 fps)</w:t>
+            </w:r>
+          </w:p>
+        </w:tc>
+        <w:tc>
+          <w:tcPr>
+            <w:tcW w:type="dxa" w:w="1500"/>
+            <w:shd w:fill="F0FDF4"/>
+            <w:tcMar>
+              <w:top w:w="60" w:type="dxa"/>
+              <w:bottom w:w="60" w:type="dxa"/>
+              <w:left w:w="60" w:type="dxa"/>
+              <w:right w:w="60" w:type="dxa"/>
+            </w:tcMar>
+          </w:tcPr>
+          <w:p>
+            <w:pPr>
+              <w:jc w:val="center"/>
+            </w:pPr>
+            <w:r>
+              <w:rPr>
+                <w:rFonts w:ascii="Times New Roman" w:hAnsi="Times New Roman"/>
+                <w:b/>
+                <w:sz w:val="19"/>
+              </w:rPr>
+              <w:t>1,500</w:t>
+            </w:r>
+          </w:p>
+        </w:tc>
+        <w:tc>
+          <w:tcPr>
+            <w:tcW w:type="dxa" w:w="1500"/>
+            <w:shd w:fill="F0FDF4"/>
+            <w:tcMar>
+              <w:top w:w="60" w:type="dxa"/>
+              <w:bottom w:w="60" w:type="dxa"/>
+              <w:left w:w="60" w:type="dxa"/>
+              <w:right w:w="60" w:type="dxa"/>
+            </w:tcMar>
+          </w:tcPr>
+          <w:p>
+            <w:pPr>
+              <w:jc w:val="center"/>
+            </w:pPr>
+            <w:r>
+              <w:rPr>
+                <w:rFonts w:ascii="Times New Roman" w:hAnsi="Times New Roman"/>
+                <w:b/>
+                <w:sz w:val="19"/>
+              </w:rPr>
+              <w:t>0.279</w:t>
+            </w:r>
+          </w:p>
+        </w:tc>
+        <w:tc>
+          <w:tcPr>
+            <w:tcW w:type="dxa" w:w="1650"/>
+            <w:shd w:fill="F0FDF4"/>
+            <w:tcMar>
+              <w:top w:w="60" w:type="dxa"/>
+              <w:bottom w:w="60" w:type="dxa"/>
+              <w:left w:w="60" w:type="dxa"/>
+              <w:right w:w="60" w:type="dxa"/>
+            </w:tcMar>
+          </w:tcPr>
+          <w:p>
+            <w:pPr>
+              <w:jc w:val="center"/>
+            </w:pPr>
+            <w:r>
+              <w:rPr>
+                <w:rFonts w:ascii="Times New Roman" w:hAnsi="Times New Roman"/>
+                <w:b/>
+                <w:sz w:val="19"/>
+              </w:rPr>
+              <w:t>0.303</w:t>
+            </w:r>
+          </w:p>
+        </w:tc>
+        <w:tc>
+          <w:tcPr>
+            <w:tcW w:type="dxa" w:w="1650"/>
+            <w:shd w:fill="F0FDF4"/>
+            <w:tcMar>
+              <w:top w:w="60" w:type="dxa"/>
+              <w:bottom w:w="60" w:type="dxa"/>
+              <w:left w:w="60" w:type="dxa"/>
+              <w:right w:w="60" w:type="dxa"/>
+            </w:tcMar>
+          </w:tcPr>
+          <w:p>
+            <w:pPr>
+              <w:jc w:val="center"/>
+            </w:pPr>
+            <w:r>
+              <w:rPr>
+                <w:rFonts w:ascii="Times New Roman" w:hAnsi="Times New Roman"/>
+                <w:b/>
+                <w:sz w:val="19"/>
+              </w:rPr>
+              <w:t>0.138</w:t>
+            </w:r>
+          </w:p>
+        </w:tc>
+      </w:tr>
+    </w:tbl>
+    <w:p>
+      <w:pPr>
+        <w:spacing w:before="0" w:after="120" w:line="360" w:lineRule="auto"/>
+        <w:jc w:val="both"/>
+      </w:pPr>
+      <w:r>
+        <w:rPr>
+          <w:rFonts w:ascii="Times New Roman" w:hAnsi="Times New Roman"/>
+          <w:b w:val="0"/>
+          <w:i w:val="0"/>
+          <w:sz w:val="24"/>
+        </w:rPr>
+        <w:t>Root-cause analysis of the weaker legacy conditions identified five defects under milestone M12 — RC-A (capture window clipping signs), RC-B (requestAnimationFrame frame duplication over a 30 fps camera), RC-C (frontend threshold stacking over the backend policy), RC-E (fixed 2.5 s cooldown), and RC-F (speech interruption) — all of which have since been corrected in the code. These figures remain an offline proxy rather than a measurement of live accuracy: the live-camera protocol of milestone M13 (80 manual single-sign attempts plus held-sign, repeat and sentence rows) has not yet been executed, and its results are pending.</w:t>
+      </w:r>
+    </w:p>
     <w:p>
       <w:pPr>
         <w:spacing w:before="280" w:after="80" w:line="276" w:lineRule="auto"/>
@@ -9287,7 +10149,7 @@
                 <w:rFonts w:ascii="Times New Roman" w:hAnsi="Times New Roman"/>
                 <w:sz w:val="19"/>
               </w:rPr>
-              <w:t>Unified Deep 2-Layer GRU (128-&gt;64 units) with Dropout</w:t>
+              <w:t>LSTM+GRU+mirror-TTA ensemble (128-&gt;64 units per branch)</w:t>
             </w:r>
           </w:p>
         </w:tc>
@@ -9349,7 +10211,7 @@
                 <w:rFonts w:ascii="Times New Roman" w:hAnsi="Times New Roman"/>
                 <w:sz w:val="19"/>
               </w:rPr>
-              <w:t>Two-handed &amp; single-handed signs (50 vocabulary classes)</w:t>
+              <w:t>Two-handed &amp; single-handed signs (109 vocabulary classes)</w:t>
             </w:r>
           </w:p>
         </w:tc>
@@ -9411,7 +10273,7 @@
                 <w:rFonts w:ascii="Times New Roman" w:hAnsi="Times New Roman"/>
                 <w:sz w:val="19"/>
               </w:rPr>
-              <w:t>0.36 ms / sequence on standard CPU (~2,777 FPS capacity)</w:t>
+              <w:t>≈0.37 s p50 per sign window on standard CPU (windows-aware ensemble probe)</w:t>
             </w:r>
           </w:p>
         </w:tc>
@@ -9548,10 +10410,10 @@
         <w:rPr>
           <w:b/>
         </w:rPr>
-        <w:t xml:space="preserve">• Ultra-Low Latency Inference: </w:t>
+        <w:t xml:space="preserve">• Sub-Second Latency Inference: </w:t>
       </w:r>
       <w:r>
-        <w:t>Achieves 0.36 ms CPU inference latency per sample, running effortlessly on low-power consumer devices without demanding high-end GPUs.</w:t>
+        <w:t>Achieves ≈0.29 s (VAL) / ≈0.37 s (TEST) p50 per sign window on CPU, running comfortably on low-power consumer devices without demanding high-end GPUs.</w:t>
       </w:r>
     </w:p>
     <w:p>
@@ -9731,7 +10593,7 @@
         <w:t xml:space="preserve">• Vocabulary Expansion: </w:t>
       </w:r>
       <w:r>
-        <w:t>Scaling the recognition lexicon from 50 foundational classes to over 1,000 conversational signs encompassing multi-regional Indian Sign Language dialects.</w:t>
+        <w:t>Scaling the recognition lexicon from 109 foundational classes to over 1,000 conversational signs encompassing multi-regional Indian Sign Language dialects; a first expansion queue (`vocab_queue_200`) already curates 91 additional words awaiting real source data before any larger-class training run.</w:t>
       </w:r>
     </w:p>
     <w:p>
@@ -9826,7 +10688,7 @@
           <w:i w:val="0"/>
           <w:sz w:val="24"/>
         </w:rPr>
-        <w:t>The engineered 189-dimensional temporal feature vector provides rich spatial and motion descriptors that enable the deep two-layer Gated Recurrent Unit (GRU) neural network to attain 82.42% accuracy, 83.24% macro precision, and 82.30% macro F1-score on a strictly signer-disjoint test set of 1,650 samples across 50 ISL classes. Operating with an ultra-low inference latency of just 0.36 milliseconds per sample on CPU, the architecture readily supports smooth real-time performance. By closing the communication loop with real-time sentence accumulation, client-side speech synthesis via the Web Speech API, and a reverse Text-to-Sign query engine, SignBridge AI represents a vital, practical step toward digital accessibility and social inclusion for the deaf and hard-of-hearing community in India.</w:t>
+        <w:t>The engineered 189-dimensional temporal feature vector provides rich spatial and motion descriptors that enable the deployed three-way ensemble of deep two-layer recurrent networks (LSTM 128→64, GRU 128→64, and mirror test-time augmentation) to attain 81.29% accuracy, 81.90% macro precision, and 80.79% macro F1-score on a strictly signer-disjoint test set of 3,629 samples across 109 ISL classes. Operating with sub-second inference latency — p50 ≈0.29 s on validation and ≈0.37 s on test per sign window on CPU — the architecture readily supports smooth real-time performance. By closing the communication loop with real-time sentence accumulation, client-side speech synthesis via the Web Speech API, and a reverse Text-to-Sign query engine, SignBridge AI represents a vital, practical step toward digital accessibility and social inclusion for the deaf and hard-of-hearing community in India.</w:t>
       </w:r>
     </w:p>
     <w:p>

</xml_diff>